<commit_message>
docs: align candidate with architecture review
</commit_message>
<xml_diff>
--- a/AURA/submission/AURA_AFTER_FEEDBACK_REPORT.docx
+++ b/AURA/submission/AURA_AFTER_FEEDBACK_REPORT.docx
@@ -54,7 +54,7 @@
           <w:rFonts w:ascii="Arial" w:hAnsi="Arial" w:eastAsia="Arial"/>
           <w:i w:val="0"/>
         </w:rPr>
-        <w:t>Candidate đã triển khai năm thay đổi trong cùng kiến trúc hiện hành gồm batch upload, số tiền AI suy ra có provenance, dashboard ngày tháng năm, báo cáo CSV và privacy triage fail safe. Release build đạt 0 warning 0 error, 181 trên 181 test offline. Thay đổi báo cáo không sửa database model.</w:t>
+        <w:t>Candidate đã triển khai năm thay đổi trong cùng kiến trúc hiện hành gồm lượt chọn nhiều ảnh, số tiền AI suy ra có provenance, dashboard ngày tháng năm, báo cáo CSV và privacy triage fail safe. Release build đạt 0 warning 0 error, 181 trên 181 test offline. Thay đổi báo cáo không sửa database model.</w:t>
       </w:r>
     </w:p>
     <w:p>
@@ -219,9 +219,9 @@
             <w:tcW w:type="dxa" w:w="1701"/>
             <w:vAlign w:val="center"/>
             <w:tcMar>
-              <w:top w:w="100" w:type="dxa"/>
+              <w:top w:w="55" w:type="dxa"/>
               <w:start w:w="120" w:type="dxa"/>
-              <w:bottom w:w="100" w:type="dxa"/>
+              <w:bottom w:w="55" w:type="dxa"/>
               <w:end w:w="120" w:type="dxa"/>
             </w:tcMar>
           </w:tcPr>
@@ -241,9 +241,9 @@
             <w:tcW w:type="dxa" w:w="1247"/>
             <w:vAlign w:val="center"/>
             <w:tcMar>
-              <w:top w:w="100" w:type="dxa"/>
+              <w:top w:w="55" w:type="dxa"/>
               <w:start w:w="120" w:type="dxa"/>
-              <w:bottom w:w="100" w:type="dxa"/>
+              <w:bottom w:w="55" w:type="dxa"/>
               <w:end w:w="120" w:type="dxa"/>
             </w:tcMar>
           </w:tcPr>
@@ -266,9 +266,9 @@
             <w:tcW w:type="dxa" w:w="4195"/>
             <w:vAlign w:val="center"/>
             <w:tcMar>
-              <w:top w:w="100" w:type="dxa"/>
+              <w:top w:w="55" w:type="dxa"/>
               <w:start w:w="120" w:type="dxa"/>
-              <w:bottom w:w="100" w:type="dxa"/>
+              <w:bottom w:w="55" w:type="dxa"/>
               <w:end w:w="120" w:type="dxa"/>
             </w:tcMar>
           </w:tcPr>
@@ -288,9 +288,9 @@
             <w:tcW w:type="dxa" w:w="2721"/>
             <w:vAlign w:val="center"/>
             <w:tcMar>
-              <w:top w:w="100" w:type="dxa"/>
+              <w:top w:w="55" w:type="dxa"/>
               <w:start w:w="120" w:type="dxa"/>
-              <w:bottom w:w="100" w:type="dxa"/>
+              <w:bottom w:w="55" w:type="dxa"/>
               <w:end w:w="120" w:type="dxa"/>
             </w:tcMar>
           </w:tcPr>
@@ -301,7 +301,7 @@
                 <w:i w:val="0"/>
                 <w:sz w:val="17"/>
               </w:rPr>
-              <w:t>5 MB mỗi ảnh chưa có PDF</w:t>
+              <w:t>Mỗi ảnh là job riêng chưa có batchId hoặc PDF</w:t>
             </w:r>
           </w:p>
         </w:tc>
@@ -312,9 +312,9 @@
             <w:tcW w:type="dxa" w:w="1701"/>
             <w:vAlign w:val="center"/>
             <w:tcMar>
-              <w:top w:w="100" w:type="dxa"/>
+              <w:top w:w="55" w:type="dxa"/>
               <w:start w:w="120" w:type="dxa"/>
-              <w:bottom w:w="100" w:type="dxa"/>
+              <w:bottom w:w="55" w:type="dxa"/>
               <w:end w:w="120" w:type="dxa"/>
             </w:tcMar>
             <w:shd w:fill="E8F0F6"/>
@@ -335,9 +335,9 @@
             <w:tcW w:type="dxa" w:w="1247"/>
             <w:vAlign w:val="center"/>
             <w:tcMar>
-              <w:top w:w="100" w:type="dxa"/>
+              <w:top w:w="55" w:type="dxa"/>
               <w:start w:w="120" w:type="dxa"/>
-              <w:bottom w:w="100" w:type="dxa"/>
+              <w:bottom w:w="55" w:type="dxa"/>
               <w:end w:w="120" w:type="dxa"/>
             </w:tcMar>
             <w:shd w:fill="E8F0F6"/>
@@ -361,9 +361,9 @@
             <w:tcW w:type="dxa" w:w="4195"/>
             <w:vAlign w:val="center"/>
             <w:tcMar>
-              <w:top w:w="100" w:type="dxa"/>
+              <w:top w:w="55" w:type="dxa"/>
               <w:start w:w="120" w:type="dxa"/>
-              <w:bottom w:w="100" w:type="dxa"/>
+              <w:bottom w:w="55" w:type="dxa"/>
               <w:end w:w="120" w:type="dxa"/>
             </w:tcMar>
             <w:shd w:fill="E8F0F6"/>
@@ -384,9 +384,9 @@
             <w:tcW w:type="dxa" w:w="2721"/>
             <w:vAlign w:val="center"/>
             <w:tcMar>
-              <w:top w:w="100" w:type="dxa"/>
+              <w:top w:w="55" w:type="dxa"/>
               <w:start w:w="120" w:type="dxa"/>
-              <w:bottom w:w="100" w:type="dxa"/>
+              <w:bottom w:w="55" w:type="dxa"/>
               <w:end w:w="120" w:type="dxa"/>
             </w:tcMar>
             <w:shd w:fill="E8F0F6"/>
@@ -409,9 +409,9 @@
             <w:tcW w:type="dxa" w:w="1701"/>
             <w:vAlign w:val="center"/>
             <w:tcMar>
-              <w:top w:w="100" w:type="dxa"/>
+              <w:top w:w="55" w:type="dxa"/>
               <w:start w:w="120" w:type="dxa"/>
-              <w:bottom w:w="100" w:type="dxa"/>
+              <w:bottom w:w="55" w:type="dxa"/>
               <w:end w:w="120" w:type="dxa"/>
             </w:tcMar>
           </w:tcPr>
@@ -431,9 +431,9 @@
             <w:tcW w:type="dxa" w:w="1247"/>
             <w:vAlign w:val="center"/>
             <w:tcMar>
-              <w:top w:w="100" w:type="dxa"/>
+              <w:top w:w="55" w:type="dxa"/>
               <w:start w:w="120" w:type="dxa"/>
-              <w:bottom w:w="100" w:type="dxa"/>
+              <w:bottom w:w="55" w:type="dxa"/>
               <w:end w:w="120" w:type="dxa"/>
             </w:tcMar>
           </w:tcPr>
@@ -456,9 +456,9 @@
             <w:tcW w:type="dxa" w:w="4195"/>
             <w:vAlign w:val="center"/>
             <w:tcMar>
-              <w:top w:w="100" w:type="dxa"/>
+              <w:top w:w="55" w:type="dxa"/>
               <w:start w:w="120" w:type="dxa"/>
-              <w:bottom w:w="100" w:type="dxa"/>
+              <w:bottom w:w="55" w:type="dxa"/>
               <w:end w:w="120" w:type="dxa"/>
             </w:tcMar>
           </w:tcPr>
@@ -478,9 +478,9 @@
             <w:tcW w:type="dxa" w:w="2721"/>
             <w:vAlign w:val="center"/>
             <w:tcMar>
-              <w:top w:w="100" w:type="dxa"/>
+              <w:top w:w="55" w:type="dxa"/>
               <w:start w:w="120" w:type="dxa"/>
-              <w:bottom w:w="100" w:type="dxa"/>
+              <w:bottom w:w="55" w:type="dxa"/>
               <w:end w:w="120" w:type="dxa"/>
             </w:tcMar>
           </w:tcPr>
@@ -502,9 +502,9 @@
             <w:tcW w:type="dxa" w:w="1701"/>
             <w:vAlign w:val="center"/>
             <w:tcMar>
-              <w:top w:w="100" w:type="dxa"/>
+              <w:top w:w="55" w:type="dxa"/>
               <w:start w:w="120" w:type="dxa"/>
-              <w:bottom w:w="100" w:type="dxa"/>
+              <w:bottom w:w="55" w:type="dxa"/>
               <w:end w:w="120" w:type="dxa"/>
             </w:tcMar>
             <w:shd w:fill="E8F0F6"/>
@@ -525,9 +525,9 @@
             <w:tcW w:type="dxa" w:w="1247"/>
             <w:vAlign w:val="center"/>
             <w:tcMar>
-              <w:top w:w="100" w:type="dxa"/>
+              <w:top w:w="55" w:type="dxa"/>
               <w:start w:w="120" w:type="dxa"/>
-              <w:bottom w:w="100" w:type="dxa"/>
+              <w:bottom w:w="55" w:type="dxa"/>
               <w:end w:w="120" w:type="dxa"/>
             </w:tcMar>
             <w:shd w:fill="E8F0F6"/>
@@ -551,9 +551,9 @@
             <w:tcW w:type="dxa" w:w="4195"/>
             <w:vAlign w:val="center"/>
             <w:tcMar>
-              <w:top w:w="100" w:type="dxa"/>
+              <w:top w:w="55" w:type="dxa"/>
               <w:start w:w="120" w:type="dxa"/>
-              <w:bottom w:w="100" w:type="dxa"/>
+              <w:bottom w:w="55" w:type="dxa"/>
               <w:end w:w="120" w:type="dxa"/>
             </w:tcMar>
             <w:shd w:fill="E8F0F6"/>
@@ -574,9 +574,9 @@
             <w:tcW w:type="dxa" w:w="2721"/>
             <w:vAlign w:val="center"/>
             <w:tcMar>
-              <w:top w:w="100" w:type="dxa"/>
+              <w:top w:w="55" w:type="dxa"/>
               <w:start w:w="120" w:type="dxa"/>
-              <w:bottom w:w="100" w:type="dxa"/>
+              <w:bottom w:w="55" w:type="dxa"/>
               <w:end w:w="120" w:type="dxa"/>
             </w:tcMar>
             <w:shd w:fill="E8F0F6"/>
@@ -599,9 +599,9 @@
             <w:tcW w:type="dxa" w:w="1701"/>
             <w:vAlign w:val="center"/>
             <w:tcMar>
-              <w:top w:w="100" w:type="dxa"/>
+              <w:top w:w="55" w:type="dxa"/>
               <w:start w:w="120" w:type="dxa"/>
-              <w:bottom w:w="100" w:type="dxa"/>
+              <w:bottom w:w="55" w:type="dxa"/>
               <w:end w:w="120" w:type="dxa"/>
             </w:tcMar>
           </w:tcPr>
@@ -621,9 +621,9 @@
             <w:tcW w:type="dxa" w:w="1247"/>
             <w:vAlign w:val="center"/>
             <w:tcMar>
-              <w:top w:w="100" w:type="dxa"/>
+              <w:top w:w="55" w:type="dxa"/>
               <w:start w:w="120" w:type="dxa"/>
-              <w:bottom w:w="100" w:type="dxa"/>
+              <w:bottom w:w="55" w:type="dxa"/>
               <w:end w:w="120" w:type="dxa"/>
             </w:tcMar>
           </w:tcPr>
@@ -646,9 +646,9 @@
             <w:tcW w:type="dxa" w:w="4195"/>
             <w:vAlign w:val="center"/>
             <w:tcMar>
-              <w:top w:w="100" w:type="dxa"/>
+              <w:top w:w="55" w:type="dxa"/>
               <w:start w:w="120" w:type="dxa"/>
-              <w:bottom w:w="100" w:type="dxa"/>
+              <w:bottom w:w="55" w:type="dxa"/>
               <w:end w:w="120" w:type="dxa"/>
             </w:tcMar>
           </w:tcPr>
@@ -668,9 +668,9 @@
             <w:tcW w:type="dxa" w:w="2721"/>
             <w:vAlign w:val="center"/>
             <w:tcMar>
-              <w:top w:w="100" w:type="dxa"/>
+              <w:top w:w="55" w:type="dxa"/>
               <w:start w:w="120" w:type="dxa"/>
-              <w:bottom w:w="100" w:type="dxa"/>
+              <w:bottom w:w="55" w:type="dxa"/>
               <w:end w:w="120" w:type="dxa"/>
             </w:tcMar>
           </w:tcPr>
@@ -692,9 +692,9 @@
             <w:tcW w:type="dxa" w:w="1701"/>
             <w:vAlign w:val="center"/>
             <w:tcMar>
-              <w:top w:w="100" w:type="dxa"/>
+              <w:top w:w="55" w:type="dxa"/>
               <w:start w:w="120" w:type="dxa"/>
-              <w:bottom w:w="100" w:type="dxa"/>
+              <w:bottom w:w="55" w:type="dxa"/>
               <w:end w:w="120" w:type="dxa"/>
             </w:tcMar>
             <w:shd w:fill="E8F0F6"/>
@@ -715,9 +715,9 @@
             <w:tcW w:type="dxa" w:w="1247"/>
             <w:vAlign w:val="center"/>
             <w:tcMar>
-              <w:top w:w="100" w:type="dxa"/>
+              <w:top w:w="55" w:type="dxa"/>
               <w:start w:w="120" w:type="dxa"/>
-              <w:bottom w:w="100" w:type="dxa"/>
+              <w:bottom w:w="55" w:type="dxa"/>
               <w:end w:w="120" w:type="dxa"/>
             </w:tcMar>
             <w:shd w:fill="E8F0F6"/>
@@ -741,9 +741,9 @@
             <w:tcW w:type="dxa" w:w="4195"/>
             <w:vAlign w:val="center"/>
             <w:tcMar>
-              <w:top w:w="100" w:type="dxa"/>
+              <w:top w:w="55" w:type="dxa"/>
               <w:start w:w="120" w:type="dxa"/>
-              <w:bottom w:w="100" w:type="dxa"/>
+              <w:bottom w:w="55" w:type="dxa"/>
               <w:end w:w="120" w:type="dxa"/>
             </w:tcMar>
             <w:shd w:fill="E8F0F6"/>
@@ -764,9 +764,9 @@
             <w:tcW w:type="dxa" w:w="2721"/>
             <w:vAlign w:val="center"/>
             <w:tcMar>
-              <w:top w:w="100" w:type="dxa"/>
+              <w:top w:w="55" w:type="dxa"/>
               <w:start w:w="120" w:type="dxa"/>
-              <w:bottom w:w="100" w:type="dxa"/>
+              <w:bottom w:w="55" w:type="dxa"/>
               <w:end w:w="120" w:type="dxa"/>
             </w:tcMar>
             <w:shd w:fill="E8F0F6"/>
@@ -812,7 +812,7 @@
           <w:rFonts w:ascii="Arial" w:hAnsi="Arial" w:eastAsia="Arial"/>
           <w:i w:val="0"/>
         </w:rPr>
-        <w:t>Các boundary chính không đổi. Model chỉ đọc facts, C Sharp áp policy tất định và con người chịu trách nhiệm ngoại lệ. Privacy triage nằm sau structured extraction và semantic validation nhưng trước policy decision.</w:t>
+        <w:t>Các boundary chính không đổi. Model chỉ đọc facts, C Sharp áp policy tất định và con người chịu trách nhiệm ngoại lệ. Privacy triage nằm sau structured extraction và semantic validation nhưng trước policy decision. Lượt chọn nhiều ảnh chỉ là tiện ích intake phía giao diện. Mỗi ảnh nhận status URL và SQL row riêng; candidate chưa có aggregate InvoiceBatch hoặc batch transaction phía server.</w:t>
       </w:r>
     </w:p>
     <w:p>
@@ -1068,14 +1068,14 @@
           <w:b/>
           <w:i w:val="0"/>
         </w:rPr>
-        <w:t xml:space="preserve">Batch không làm mất job đã nhận. </w:t>
+        <w:t xml:space="preserve">Lượt nhiều ảnh không làm mất job đã nhận. </w:t>
       </w:r>
       <w:r>
         <w:rPr>
           <w:rFonts w:ascii="Arial" w:hAnsi="Arial" w:eastAsia="Arial"/>
           <w:i w:val="0"/>
         </w:rPr>
-        <w:t>UI lưu danh sách pending ngay sau từng HTTP 202 nên file sau lỗi không xóa SQL job trước.</w:t>
+        <w:t>UI lưu danh sách pending ngay sau từng HTTP 202 nên file sau lỗi không xóa SQL job trước; mỗi ảnh vẫn là một hồ sơ độc lập.</w:t>
       </w:r>
     </w:p>
     <w:p>
@@ -1117,7 +1117,7 @@
           <w:rFonts w:ascii="Arial" w:hAnsi="Arial" w:eastAsia="Arial"/>
           <w:i w:val="0"/>
         </w:rPr>
-        <w:t>Model phát marker category chuẩn backend chỉ nhận allow list và không ghi raw value vào warning.</w:t>
+        <w:t>Model phát marker category chuẩn backend chỉ nhận allow list và không ghi raw value vào warning. Vì triage chạy sau VLM demo ưu tiên chứng từ tổng hợp hoặc đã ẩn danh; production cần pre inference control cho dữ liệu nhạy cảm.</w:t>
       </w:r>
     </w:p>
     <w:p>
@@ -1345,9 +1345,9 @@
           <w:tcPr>
             <w:tcW w:type="dxa" w:w="2835"/>
             <w:tcMar>
-              <w:top w:w="100" w:type="dxa"/>
+              <w:top w:w="35" w:type="dxa"/>
               <w:start w:w="120" w:type="dxa"/>
-              <w:bottom w:w="100" w:type="dxa"/>
+              <w:bottom w:w="35" w:type="dxa"/>
               <w:end w:w="120" w:type="dxa"/>
             </w:tcMar>
             <w:vAlign w:val="center"/>
@@ -1367,9 +1367,9 @@
           <w:tcPr>
             <w:tcW w:type="dxa" w:w="1361"/>
             <w:tcMar>
-              <w:top w:w="100" w:type="dxa"/>
+              <w:top w:w="35" w:type="dxa"/>
               <w:start w:w="120" w:type="dxa"/>
-              <w:bottom w:w="100" w:type="dxa"/>
+              <w:bottom w:w="35" w:type="dxa"/>
               <w:end w:w="120" w:type="dxa"/>
             </w:tcMar>
             <w:vAlign w:val="center"/>
@@ -1394,9 +1394,9 @@
           <w:tcPr>
             <w:tcW w:type="dxa" w:w="5669"/>
             <w:tcMar>
-              <w:top w:w="100" w:type="dxa"/>
+              <w:top w:w="35" w:type="dxa"/>
               <w:start w:w="120" w:type="dxa"/>
-              <w:bottom w:w="100" w:type="dxa"/>
+              <w:bottom w:w="35" w:type="dxa"/>
               <w:end w:w="120" w:type="dxa"/>
             </w:tcMar>
             <w:vAlign w:val="center"/>
@@ -1418,9 +1418,9 @@
           <w:tcPr>
             <w:tcW w:type="dxa" w:w="2835"/>
             <w:tcMar>
-              <w:top w:w="100" w:type="dxa"/>
+              <w:top w:w="35" w:type="dxa"/>
               <w:start w:w="120" w:type="dxa"/>
-              <w:bottom w:w="100" w:type="dxa"/>
+              <w:bottom w:w="35" w:type="dxa"/>
               <w:end w:w="120" w:type="dxa"/>
             </w:tcMar>
             <w:vAlign w:val="center"/>
@@ -1441,9 +1441,9 @@
           <w:tcPr>
             <w:tcW w:type="dxa" w:w="1361"/>
             <w:tcMar>
-              <w:top w:w="100" w:type="dxa"/>
+              <w:top w:w="35" w:type="dxa"/>
               <w:start w:w="120" w:type="dxa"/>
-              <w:bottom w:w="100" w:type="dxa"/>
+              <w:bottom w:w="35" w:type="dxa"/>
               <w:end w:w="120" w:type="dxa"/>
             </w:tcMar>
             <w:vAlign w:val="center"/>
@@ -1469,9 +1469,9 @@
           <w:tcPr>
             <w:tcW w:type="dxa" w:w="5669"/>
             <w:tcMar>
-              <w:top w:w="100" w:type="dxa"/>
+              <w:top w:w="35" w:type="dxa"/>
               <w:start w:w="120" w:type="dxa"/>
-              <w:bottom w:w="100" w:type="dxa"/>
+              <w:bottom w:w="35" w:type="dxa"/>
               <w:end w:w="120" w:type="dxa"/>
             </w:tcMar>
             <w:vAlign w:val="center"/>
@@ -1494,9 +1494,9 @@
           <w:tcPr>
             <w:tcW w:type="dxa" w:w="2835"/>
             <w:tcMar>
-              <w:top w:w="100" w:type="dxa"/>
+              <w:top w:w="35" w:type="dxa"/>
               <w:start w:w="120" w:type="dxa"/>
-              <w:bottom w:w="100" w:type="dxa"/>
+              <w:bottom w:w="35" w:type="dxa"/>
               <w:end w:w="120" w:type="dxa"/>
             </w:tcMar>
             <w:vAlign w:val="center"/>
@@ -1516,9 +1516,9 @@
           <w:tcPr>
             <w:tcW w:type="dxa" w:w="1361"/>
             <w:tcMar>
-              <w:top w:w="100" w:type="dxa"/>
+              <w:top w:w="35" w:type="dxa"/>
               <w:start w:w="120" w:type="dxa"/>
-              <w:bottom w:w="100" w:type="dxa"/>
+              <w:bottom w:w="35" w:type="dxa"/>
               <w:end w:w="120" w:type="dxa"/>
             </w:tcMar>
             <w:vAlign w:val="center"/>
@@ -1543,9 +1543,9 @@
           <w:tcPr>
             <w:tcW w:type="dxa" w:w="5669"/>
             <w:tcMar>
-              <w:top w:w="100" w:type="dxa"/>
+              <w:top w:w="35" w:type="dxa"/>
               <w:start w:w="120" w:type="dxa"/>
-              <w:bottom w:w="100" w:type="dxa"/>
+              <w:bottom w:w="35" w:type="dxa"/>
               <w:end w:w="120" w:type="dxa"/>
             </w:tcMar>
             <w:vAlign w:val="center"/>
@@ -1567,9 +1567,9 @@
           <w:tcPr>
             <w:tcW w:type="dxa" w:w="2835"/>
             <w:tcMar>
-              <w:top w:w="100" w:type="dxa"/>
+              <w:top w:w="35" w:type="dxa"/>
               <w:start w:w="120" w:type="dxa"/>
-              <w:bottom w:w="100" w:type="dxa"/>
+              <w:bottom w:w="35" w:type="dxa"/>
               <w:end w:w="120" w:type="dxa"/>
             </w:tcMar>
             <w:vAlign w:val="center"/>
@@ -1590,9 +1590,9 @@
           <w:tcPr>
             <w:tcW w:type="dxa" w:w="1361"/>
             <w:tcMar>
-              <w:top w:w="100" w:type="dxa"/>
+              <w:top w:w="35" w:type="dxa"/>
               <w:start w:w="120" w:type="dxa"/>
-              <w:bottom w:w="100" w:type="dxa"/>
+              <w:bottom w:w="35" w:type="dxa"/>
               <w:end w:w="120" w:type="dxa"/>
             </w:tcMar>
             <w:vAlign w:val="center"/>
@@ -1618,9 +1618,9 @@
           <w:tcPr>
             <w:tcW w:type="dxa" w:w="5669"/>
             <w:tcMar>
-              <w:top w:w="100" w:type="dxa"/>
+              <w:top w:w="35" w:type="dxa"/>
               <w:start w:w="120" w:type="dxa"/>
-              <w:bottom w:w="100" w:type="dxa"/>
+              <w:bottom w:w="35" w:type="dxa"/>
               <w:end w:w="120" w:type="dxa"/>
             </w:tcMar>
             <w:vAlign w:val="center"/>
@@ -1643,9 +1643,9 @@
           <w:tcPr>
             <w:tcW w:type="dxa" w:w="2835"/>
             <w:tcMar>
-              <w:top w:w="100" w:type="dxa"/>
+              <w:top w:w="35" w:type="dxa"/>
               <w:start w:w="120" w:type="dxa"/>
-              <w:bottom w:w="100" w:type="dxa"/>
+              <w:bottom w:w="35" w:type="dxa"/>
               <w:end w:w="120" w:type="dxa"/>
             </w:tcMar>
             <w:vAlign w:val="center"/>
@@ -1665,9 +1665,9 @@
           <w:tcPr>
             <w:tcW w:type="dxa" w:w="1361"/>
             <w:tcMar>
-              <w:top w:w="100" w:type="dxa"/>
+              <w:top w:w="35" w:type="dxa"/>
               <w:start w:w="120" w:type="dxa"/>
-              <w:bottom w:w="100" w:type="dxa"/>
+              <w:bottom w:w="35" w:type="dxa"/>
               <w:end w:w="120" w:type="dxa"/>
             </w:tcMar>
             <w:vAlign w:val="center"/>
@@ -1692,9 +1692,9 @@
           <w:tcPr>
             <w:tcW w:type="dxa" w:w="5669"/>
             <w:tcMar>
-              <w:top w:w="100" w:type="dxa"/>
+              <w:top w:w="35" w:type="dxa"/>
               <w:start w:w="120" w:type="dxa"/>
-              <w:bottom w:w="100" w:type="dxa"/>
+              <w:bottom w:w="35" w:type="dxa"/>
               <w:end w:w="120" w:type="dxa"/>
             </w:tcMar>
             <w:vAlign w:val="center"/>
@@ -1726,7 +1726,7 @@
           <w:rFonts w:ascii="Arial" w:hAnsi="Arial" w:eastAsia="Arial"/>
           <w:i w:val="0"/>
         </w:rPr>
-        <w:t>Lỗi registry runtime trên máy kiểm tra không chứng minh database live hỏng và không phát sinh từ migration. Không xóa registry LocalDB hoặc MDF khi chưa có backup.</w:t>
+        <w:t>Lỗi registry runtime trên máy kiểm tra không chứng minh database live hỏng và không phát sinh từ migration. Không xóa registry LocalDB hoặc MDF khi chưa có backup. Read only live health trả 200 nhưng dashboard candidate chưa xuất hiện và CSV trả 404 nên production vẫn là baseline cũ.</w:t>
       </w:r>
     </w:p>
     <w:p>
@@ -1859,7 +1859,7 @@
               <w:rPr>
                 <w:rFonts w:ascii="Arial" w:hAnsi="Arial" w:eastAsia="Arial"/>
                 <w:i w:val="0"/>
-                <w:sz w:val="17"/>
+                <w:sz w:val="16"/>
               </w:rPr>
               <w:t>25 giây</w:t>
             </w:r>
@@ -1881,7 +1881,7 @@
               <w:rPr>
                 <w:rFonts w:ascii="Arial" w:hAnsi="Arial" w:eastAsia="Arial"/>
                 <w:i w:val="0"/>
-                <w:sz w:val="17"/>
+                <w:sz w:val="16"/>
               </w:rPr>
               <w:t>Mở Tổng quan</w:t>
             </w:r>
@@ -1903,7 +1903,7 @@
               <w:rPr>
                 <w:rFonts w:ascii="Arial" w:hAnsi="Arial" w:eastAsia="Arial"/>
                 <w:i w:val="0"/>
-                <w:sz w:val="17"/>
+                <w:sz w:val="16"/>
               </w:rPr>
               <w:t>Nêu số liệu từ SQL ở ba mức ngày tháng năm và tải CSV tháng.</w:t>
             </w:r>
@@ -1931,7 +1931,7 @@
               <w:rPr>
                 <w:rFonts w:ascii="Arial" w:hAnsi="Arial" w:eastAsia="Arial"/>
                 <w:i w:val="0"/>
-                <w:sz w:val="17"/>
+                <w:sz w:val="16"/>
               </w:rPr>
               <w:t>35 giây</w:t>
             </w:r>
@@ -1954,9 +1954,9 @@
               <w:rPr>
                 <w:rFonts w:ascii="Arial" w:hAnsi="Arial" w:eastAsia="Arial"/>
                 <w:i w:val="0"/>
-                <w:sz w:val="17"/>
+                <w:sz w:val="16"/>
               </w:rPr>
-              <w:t>Batch intake</w:t>
+              <w:t>Lượt nhiều ảnh</w:t>
             </w:r>
           </w:p>
         </w:tc>
@@ -1977,7 +1977,7 @@
               <w:rPr>
                 <w:rFonts w:ascii="Arial" w:hAnsi="Arial" w:eastAsia="Arial"/>
                 <w:i w:val="0"/>
-                <w:sz w:val="17"/>
+                <w:sz w:val="16"/>
               </w:rPr>
               <w:t>Chọn hai hoặc ba ảnh để trống amount và chỉ HTTP 202 cùng job riêng.</w:t>
             </w:r>
@@ -2004,7 +2004,7 @@
               <w:rPr>
                 <w:rFonts w:ascii="Arial" w:hAnsi="Arial" w:eastAsia="Arial"/>
                 <w:i w:val="0"/>
-                <w:sz w:val="17"/>
+                <w:sz w:val="16"/>
               </w:rPr>
               <w:t>25 giây</w:t>
             </w:r>
@@ -2026,7 +2026,7 @@
               <w:rPr>
                 <w:rFonts w:ascii="Arial" w:hAnsi="Arial" w:eastAsia="Arial"/>
                 <w:i w:val="0"/>
-                <w:sz w:val="17"/>
+                <w:sz w:val="16"/>
               </w:rPr>
               <w:t>Xử lý nền</w:t>
             </w:r>
@@ -2048,7 +2048,7 @@
               <w:rPr>
                 <w:rFonts w:ascii="Arial" w:hAnsi="Arial" w:eastAsia="Arial"/>
                 <w:i w:val="0"/>
-                <w:sz w:val="17"/>
+                <w:sz w:val="16"/>
               </w:rPr>
               <w:t>Chỉ PENDING hoặc PROCESSING và người dùng không bị giữ request.</w:t>
             </w:r>
@@ -2076,7 +2076,7 @@
               <w:rPr>
                 <w:rFonts w:ascii="Arial" w:hAnsi="Arial" w:eastAsia="Arial"/>
                 <w:i w:val="0"/>
-                <w:sz w:val="17"/>
+                <w:sz w:val="16"/>
               </w:rPr>
               <w:t>25 giây</w:t>
             </w:r>
@@ -2099,7 +2099,7 @@
               <w:rPr>
                 <w:rFonts w:ascii="Arial" w:hAnsi="Arial" w:eastAsia="Arial"/>
                 <w:i w:val="0"/>
-                <w:sz w:val="17"/>
+                <w:sz w:val="16"/>
               </w:rPr>
               <w:t>Amount provenance</w:t>
             </w:r>
@@ -2122,7 +2122,7 @@
               <w:rPr>
                 <w:rFonts w:ascii="Arial" w:hAnsi="Arial" w:eastAsia="Arial"/>
                 <w:i w:val="0"/>
-                <w:sz w:val="17"/>
+                <w:sz w:val="16"/>
               </w:rPr>
               <w:t>Mở facts và chỉ AI EXTRACTED hoặc USER PROVIDED.</w:t>
             </w:r>
@@ -2149,7 +2149,7 @@
               <w:rPr>
                 <w:rFonts w:ascii="Arial" w:hAnsi="Arial" w:eastAsia="Arial"/>
                 <w:i w:val="0"/>
-                <w:sz w:val="17"/>
+                <w:sz w:val="16"/>
               </w:rPr>
               <w:t>45 giây</w:t>
             </w:r>
@@ -2171,7 +2171,7 @@
               <w:rPr>
                 <w:rFonts w:ascii="Arial" w:hAnsi="Arial" w:eastAsia="Arial"/>
                 <w:i w:val="0"/>
-                <w:sz w:val="17"/>
+                <w:sz w:val="16"/>
               </w:rPr>
               <w:t>Privacy boundary</w:t>
             </w:r>
@@ -2193,7 +2193,7 @@
               <w:rPr>
                 <w:rFonts w:ascii="Arial" w:hAnsi="Arial" w:eastAsia="Arial"/>
                 <w:i w:val="0"/>
-                <w:sz w:val="17"/>
+                <w:sz w:val="16"/>
               </w:rPr>
               <w:t>Dùng synthetic receipt và chỉ ESCALATE PRIVACY không lặp raw value.</w:t>
             </w:r>
@@ -2221,7 +2221,7 @@
               <w:rPr>
                 <w:rFonts w:ascii="Arial" w:hAnsi="Arial" w:eastAsia="Arial"/>
                 <w:i w:val="0"/>
-                <w:sz w:val="17"/>
+                <w:sz w:val="16"/>
               </w:rPr>
               <w:t>30 giây</w:t>
             </w:r>
@@ -2244,7 +2244,7 @@
               <w:rPr>
                 <w:rFonts w:ascii="Arial" w:hAnsi="Arial" w:eastAsia="Arial"/>
                 <w:i w:val="0"/>
-                <w:sz w:val="17"/>
+                <w:sz w:val="16"/>
               </w:rPr>
               <w:t>Human authority</w:t>
             </w:r>
@@ -2267,7 +2267,7 @@
               <w:rPr>
                 <w:rFonts w:ascii="Arial" w:hAnsi="Arial" w:eastAsia="Arial"/>
                 <w:i w:val="0"/>
-                <w:sz w:val="17"/>
+                <w:sz w:val="16"/>
               </w:rPr>
               <w:t>Nhân viên chuyển tiếp quản lý YES NO và AI không tự cấp quyền.</w:t>
             </w:r>
@@ -2294,7 +2294,7 @@
               <w:rPr>
                 <w:rFonts w:ascii="Arial" w:hAnsi="Arial" w:eastAsia="Arial"/>
                 <w:i w:val="0"/>
-                <w:sz w:val="17"/>
+                <w:sz w:val="16"/>
               </w:rPr>
               <w:t>30 giây</w:t>
             </w:r>
@@ -2316,7 +2316,7 @@
               <w:rPr>
                 <w:rFonts w:ascii="Arial" w:hAnsi="Arial" w:eastAsia="Arial"/>
                 <w:i w:val="0"/>
-                <w:sz w:val="17"/>
+                <w:sz w:val="16"/>
               </w:rPr>
               <w:t>Audit và dashboard</w:t>
             </w:r>
@@ -2338,7 +2338,7 @@
               <w:rPr>
                 <w:rFonts w:ascii="Arial" w:hAnsi="Arial" w:eastAsia="Arial"/>
                 <w:i w:val="0"/>
-                <w:sz w:val="17"/>
+                <w:sz w:val="16"/>
               </w:rPr>
               <w:t>Mở timeline rồi refresh tổng quan.</w:t>
             </w:r>
@@ -2366,7 +2366,7 @@
               <w:rPr>
                 <w:rFonts w:ascii="Arial" w:hAnsi="Arial" w:eastAsia="Arial"/>
                 <w:i w:val="0"/>
-                <w:sz w:val="17"/>
+                <w:sz w:val="16"/>
               </w:rPr>
               <w:t>30 giây</w:t>
             </w:r>
@@ -2389,7 +2389,7 @@
               <w:rPr>
                 <w:rFonts w:ascii="Arial" w:hAnsi="Arial" w:eastAsia="Arial"/>
                 <w:i w:val="0"/>
-                <w:sz w:val="17"/>
+                <w:sz w:val="16"/>
               </w:rPr>
               <w:t>Production reality</w:t>
             </w:r>
@@ -2412,7 +2412,7 @@
               <w:rPr>
                 <w:rFonts w:ascii="Arial" w:hAnsi="Arial" w:eastAsia="Arial"/>
                 <w:i w:val="0"/>
-                <w:sz w:val="17"/>
+                <w:sz w:val="16"/>
               </w:rPr>
               <w:t>Nêu data collection deny giới hạn ZDR và connector email còn ở roadmap.</w:t>
             </w:r>
@@ -2452,6 +2452,7 @@
     </w:p>
     <w:p>
       <w:pPr>
+        <w:spacing w:after="40"/>
         <w:ind w:left="227" w:hanging="227"/>
       </w:pPr>
       <w:r>
@@ -2472,6 +2473,7 @@
     </w:p>
     <w:p>
       <w:pPr>
+        <w:spacing w:after="40"/>
         <w:ind w:left="227" w:hanging="227"/>
       </w:pPr>
       <w:r>
@@ -2492,6 +2494,7 @@
     </w:p>
     <w:p>
       <w:pPr>
+        <w:spacing w:after="40"/>
         <w:ind w:left="227" w:hanging="227"/>
       </w:pPr>
       <w:r>
@@ -2512,6 +2515,7 @@
     </w:p>
     <w:p>
       <w:pPr>
+        <w:spacing w:after="40"/>
         <w:ind w:left="227" w:hanging="227"/>
       </w:pPr>
       <w:r>
@@ -2527,11 +2531,12 @@
           <w:rFonts w:ascii="Arial" w:hAnsi="Arial" w:eastAsia="Arial"/>
           <w:i w:val="0"/>
         </w:rPr>
-        <w:t>Chạy single upload không nhập amount, batch hai ảnh và một privacy synthetic case; kiểm manager route cùng audit.</w:t>
+        <w:t>Chạy single upload không nhập amount, lượt hai ảnh và một privacy synthetic case; kiểm manager route cùng audit.</w:t>
       </w:r>
     </w:p>
     <w:p>
       <w:pPr>
+        <w:spacing w:after="40"/>
         <w:ind w:left="227" w:hanging="227"/>
       </w:pPr>
       <w:r>
@@ -2547,7 +2552,7 @@
           <w:rFonts w:ascii="Arial" w:hAnsi="Arial" w:eastAsia="Arial"/>
           <w:i w:val="0"/>
         </w:rPr>
-        <w:t>Không rerun holdout cũ để tạo accuracy claim mới; rehearsal theo thứ tự dashboard report batch privacy manager audit.</w:t>
+        <w:t>Không rerun holdout cũ để tạo accuracy claim mới; rehearsal theo thứ tự dashboard report multi file privacy manager audit.</w:t>
       </w:r>
     </w:p>
     <w:p>

</xml_diff>

<commit_message>
feat: let AI derive receipt amount
</commit_message>
<xml_diff>
--- a/AURA/submission/AURA_AFTER_FEEDBACK_REPORT.docx
+++ b/AURA/submission/AURA_AFTER_FEEDBACK_REPORT.docx
@@ -469,7 +469,7 @@
                 <w:i w:val="0"/>
                 <w:sz w:val="17"/>
               </w:rPr>
-              <w:t>Ưu tiên số người dùng nhập nếu có nếu trống dùng final total đã validation</w:t>
+              <w:t>UI bỏ ô amount; worker dùng final total AI sau validation</w:t>
             </w:r>
           </w:p>
         </w:tc>
@@ -491,7 +491,7 @@
                 <w:i w:val="0"/>
                 <w:sz w:val="17"/>
               </w:rPr>
-              <w:t>Không có total thì fail safe</w:t>
+              <w:t>Backend cũ chỉ giữ cho test kit; thiếu total thì fail safe</w:t>
             </w:r>
           </w:p>
         </w:tc>
@@ -843,7 +843,7 @@
           <w:rFonts w:ascii="Arial" w:hAnsi="Arial" w:eastAsia="Arial"/>
           <w:i w:val="0"/>
         </w:rPr>
-        <w:t>Một đến mười JPG hoặc PNG cùng metadata và amount tùy chọn</w:t>
+        <w:t>Một đến mười JPG hoặc PNG cùng metadata; UI không nhận amount</w:t>
       </w:r>
     </w:p>
     <w:p>
@@ -1096,7 +1096,7 @@
           <w:rFonts w:ascii="Arial" w:hAnsi="Arial" w:eastAsia="Arial"/>
           <w:i w:val="0"/>
         </w:rPr>
-        <w:t>Worker chỉ chọn số người dùng nhập lớn hơn không hoặc final total lớn hơn không sau validation và luôn audit nguồn.</w:t>
+        <w:t>UI không gửi amount. Worker chỉ dùng final total AI lớn hơn không sau validation và audit nguồn; nhánh cũ được giữ cho test kit.</w:t>
       </w:r>
     </w:p>
     <w:p>
@@ -1979,7 +1979,7 @@
                 <w:i w:val="0"/>
                 <w:sz w:val="16"/>
               </w:rPr>
-              <w:t>Chọn hai hoặc ba ảnh để trống amount và chỉ HTTP 202 cùng job riêng.</w:t>
+              <w:t>Chọn hai hoặc ba ảnh; UI không có ô amount; chỉ HTTP 202 cùng job riêng.</w:t>
             </w:r>
           </w:p>
         </w:tc>
@@ -2124,7 +2124,7 @@
                 <w:i w:val="0"/>
                 <w:sz w:val="16"/>
               </w:rPr>
-              <w:t>Mở facts và chỉ AI EXTRACTED hoặc USER PROVIDED.</w:t>
+              <w:t>Mở facts và chỉ AI EXTRACTED; thiếu total thì fail safe.</w:t>
             </w:r>
           </w:p>
         </w:tc>
@@ -2531,7 +2531,7 @@
           <w:rFonts w:ascii="Arial" w:hAnsi="Arial" w:eastAsia="Arial"/>
           <w:i w:val="0"/>
         </w:rPr>
-        <w:t>Chạy single upload không nhập amount, lượt hai ảnh và một privacy synthetic case; kiểm manager route cùng audit.</w:t>
+        <w:t>Chạy single upload, xác nhận không có ô amount, lượt hai ảnh và một privacy synthetic case; kiểm manager route cùng audit.</w:t>
       </w:r>
     </w:p>
     <w:p>

</xml_diff>